<commit_message>
Use split anchors in default spec template
</commit_message>
<xml_diff>
--- a/data/out_templates/项目需求说明书-输出模板.docx
+++ b/data/out_templates/项目需求说明书-输出模板.docx
@@ -4615,25 +4615,20 @@
         </w:rPr>
       </w:pPr>
       <w:r>
+        <w:t>{{模块清单表}}</w:t>
+      </w:r>
+    </w:p>
+    <w:p>
+      <w:pPr>
+        <w:pStyle w:val="3"/>
+        <w:ind w:left="0" w:leftChars="0" w:firstLine="0" w:firstLineChars="0"/>
         <w:rPr>
           <w:rFonts w:hint="default" w:ascii="Times New Roman" w:hAnsi="Times New Roman" w:cs="Times New Roman"/>
           <w:lang w:val="en-US" w:eastAsia="zh-CN"/>
         </w:rPr>
-        <w:t>{{</w:t>
-      </w:r>
-      <w:r>
-        <w:rPr>
-          <w:rFonts w:hint="eastAsia" w:ascii="Times New Roman" w:hAnsi="Times New Roman" w:cs="Times New Roman"/>
-          <w:lang w:val="en-US" w:eastAsia="zh-CN"/>
-        </w:rPr>
-        <w:t>功能需求详情</w:t>
-      </w:r>
-      <w:r>
-        <w:rPr>
-          <w:rFonts w:hint="default" w:ascii="Times New Roman" w:hAnsi="Times New Roman" w:cs="Times New Roman"/>
-          <w:lang w:val="en-US" w:eastAsia="zh-CN"/>
-        </w:rPr>
-        <w:t>}}</w:t>
+      </w:pPr>
+      <w:r>
+        <w:t>{{功能过程详情}}</w:t>
       </w:r>
     </w:p>
     <w:p>

</xml_diff>